<commit_message>
Lead the CV with the AI work
The title line becomes "Product Engineer, AI and full stack" and the summary
names the YotPoint WhatsApp agent on Claude and OpenAI models and the MCP
server, so a skim of the first few lines finds them.

Co-Authored-By: Claude Opus 5.5 <noreply@anthropic.com>
</commit_message>
<xml_diff>
--- a/public/files/FreddieKealyCV.docx
+++ b/public/files/FreddieKealyCV.docx
@@ -26,14 +26,14 @@
           <w:sz w:val="22"/>
           <w:szCs w:val="22"/>
         </w:rPr>
-        <w:t xml:space="preserve">Technical Co-Founder and Product Engineer</w:t>
+        <w:t xml:space="preserve">Product Engineer, AI and full stack</w:t>
       </w:r>
     </w:p>
     <w:p>
       <w:pPr>
         <w:spacing w:after="120"/>
       </w:pPr>
-      <w:hyperlink w:history="1" r:id="rIdqnbcnholc2jjlqs_u_opy">
+      <w:hyperlink w:history="1" r:id="rIdgw08b5jtxly3ox1toqgih">
         <w:r>
           <w:rPr>
             <w:color w:val="1F4E8C"/>
@@ -51,7 +51,7 @@
         </w:rPr>
         <w:t xml:space="preserve">   |   </w:t>
       </w:r>
-      <w:hyperlink w:history="1" r:id="rIdou0pvoobaxcu1yr6qwlxv">
+      <w:hyperlink w:history="1" r:id="rIdpedxzcuipptg2g3iwjq6u">
         <w:r>
           <w:rPr>
             <w:color w:val="1F4E8C"/>
@@ -91,7 +91,7 @@
           <w:sz w:val="20"/>
           <w:szCs w:val="20"/>
         </w:rPr>
-        <w:t xml:space="preserve">Technical co-founder and product engineer with nearly ten years of experience building products with Next.js, React, Node.js and AWS. I'm the sole developer of YotPoint, where I own the whole product: UI design, LLM workflows and serverless infrastructure. Through my own practice, fkealy, I shipped Agreed to the App Store and Google Play. Before that, at Glofox, I built new React and Node.js services to replace a legacy monolith and resolved over 50 P1 issues.</w:t>
+        <w:t xml:space="preserve">Product engineer with nearly ten years of experience building products with Next.js, React, Node.js and AWS. I'm the technical co-founder and sole developer of YotPoint, where I built a WhatsApp agent on Claude and OpenAI models that takes job requests, reads voice notes and pulls out job details, and an MCP server that lets Claude propose data updates for human review. Through my own practice, fkealy, I shipped Agreed to the App Store and Google Play. Before that, at Glofox, I built new React and Node.js services to replace a legacy monolith and resolved over 50 P1 issues.</w:t>
       </w:r>
     </w:p>
     <w:p>
@@ -163,7 +163,7 @@
         </w:rPr>
         <w:t xml:space="preserve">Shipped Agreed (</w:t>
       </w:r>
-      <w:hyperlink w:history="1" r:id="rIdlrcio1i9i7k8ftnr2km9f">
+      <w:hyperlink w:history="1" r:id="rIdnfrbpyt3hpoqsonldivq7">
         <w:r>
           <w:rPr>
             <w:color w:val="1F4E8C"/>
@@ -214,7 +214,7 @@
         </w:rPr>
         <w:t xml:space="preserve">Design and build websites and web apps for small businesses, including a 3D product launch site for Studio Rowan (</w:t>
       </w:r>
-      <w:hyperlink w:history="1" r:id="rIdpfhr1okalel-9yswyoyub">
+      <w:hyperlink w:history="1" r:id="rIdth1cwrxau4opwrfdxqfwj">
         <w:r>
           <w:rPr>
             <w:color w:val="1F4E8C"/>
@@ -281,7 +281,7 @@
         </w:rPr>
         <w:t xml:space="preserve">Sole developer of YotPoint (</w:t>
       </w:r>
-      <w:hyperlink w:history="1" r:id="rIdrrbxik4ttc0msy4fktinv">
+      <w:hyperlink w:history="1" r:id="rIdr14uxysu-xwvrchdsbg_b">
         <w:r>
           <w:rPr>
             <w:color w:val="1F4E8C"/>

</xml_diff>

<commit_message>
Name OpenRouter in the CV summary
Co-Authored-By: Claude Opus 5.5 <noreply@anthropic.com>
</commit_message>
<xml_diff>
--- a/public/files/FreddieKealyCV.docx
+++ b/public/files/FreddieKealyCV.docx
@@ -33,7 +33,7 @@
       <w:pPr>
         <w:spacing w:after="120"/>
       </w:pPr>
-      <w:hyperlink w:history="1" r:id="rIdgw08b5jtxly3ox1toqgih">
+      <w:hyperlink w:history="1" r:id="rIdjpj7gbphc8wmg4bmzl8bv">
         <w:r>
           <w:rPr>
             <w:color w:val="1F4E8C"/>
@@ -51,7 +51,7 @@
         </w:rPr>
         <w:t xml:space="preserve">   |   </w:t>
       </w:r>
-      <w:hyperlink w:history="1" r:id="rIdpedxzcuipptg2g3iwjq6u">
+      <w:hyperlink w:history="1" r:id="rIdtgmqzlhjboju4zbw9dn5e">
         <w:r>
           <w:rPr>
             <w:color w:val="1F4E8C"/>
@@ -91,7 +91,7 @@
           <w:sz w:val="20"/>
           <w:szCs w:val="20"/>
         </w:rPr>
-        <w:t xml:space="preserve">Product engineer with nearly ten years of experience building products with Next.js, React, Node.js and AWS. I'm the technical co-founder and sole developer of YotPoint, where I built a WhatsApp agent on Claude and OpenAI models that takes job requests, reads voice notes and pulls out job details, and an MCP server that lets Claude propose data updates for human review. Through my own practice, fkealy, I shipped Agreed to the App Store and Google Play. Before that, at Glofox, I built new React and Node.js services to replace a legacy monolith and resolved over 50 P1 issues.</w:t>
+        <w:t xml:space="preserve">Product engineer with nearly ten years of experience building products with Next.js, React, Node.js and AWS. I'm the technical co-founder and sole developer of YotPoint, where I built a WhatsApp agent that runs LLMs through OpenRouter to take job requests, read voice notes and pull out job details, and an MCP server that lets Claude propose data updates for human review. Through my own practice, fkealy, I shipped Agreed to the App Store and Google Play. Before that, at Glofox, I built new React and Node.js services to replace a legacy monolith and resolved over 50 P1 issues.</w:t>
       </w:r>
     </w:p>
     <w:p>
@@ -163,7 +163,7 @@
         </w:rPr>
         <w:t xml:space="preserve">Shipped Agreed (</w:t>
       </w:r>
-      <w:hyperlink w:history="1" r:id="rIdnfrbpyt3hpoqsonldivq7">
+      <w:hyperlink w:history="1" r:id="rIdazwoqqe5w6v1n3_k1jydc">
         <w:r>
           <w:rPr>
             <w:color w:val="1F4E8C"/>
@@ -214,7 +214,7 @@
         </w:rPr>
         <w:t xml:space="preserve">Design and build websites and web apps for small businesses, including a 3D product launch site for Studio Rowan (</w:t>
       </w:r>
-      <w:hyperlink w:history="1" r:id="rIdth1cwrxau4opwrfdxqfwj">
+      <w:hyperlink w:history="1" r:id="rIdlg6wmkretyejxn8_n4-mv">
         <w:r>
           <w:rPr>
             <w:color w:val="1F4E8C"/>
@@ -281,7 +281,7 @@
         </w:rPr>
         <w:t xml:space="preserve">Sole developer of YotPoint (</w:t>
       </w:r>
-      <w:hyperlink w:history="1" r:id="rIdr14uxysu-xwvrchdsbg_b">
+      <w:hyperlink w:history="1" r:id="rIdo0tfwk70yvxz9cc5picbd">
         <w:r>
           <w:rPr>
             <w:color w:val="1F4E8C"/>

</xml_diff>

<commit_message>
Say LLMs instead of naming the model vendors
Co-Authored-By: Claude Opus 5.5 <noreply@anthropic.com>
</commit_message>
<xml_diff>
--- a/public/files/FreddieKealyCV.docx
+++ b/public/files/FreddieKealyCV.docx
@@ -33,7 +33,7 @@
       <w:pPr>
         <w:spacing w:after="120"/>
       </w:pPr>
-      <w:hyperlink w:history="1" r:id="rIdjpj7gbphc8wmg4bmzl8bv">
+      <w:hyperlink w:history="1" r:id="rIdn2l6satdoxvymzmbu3eeh">
         <w:r>
           <w:rPr>
             <w:color w:val="1F4E8C"/>
@@ -51,7 +51,7 @@
         </w:rPr>
         <w:t xml:space="preserve">   |   </w:t>
       </w:r>
-      <w:hyperlink w:history="1" r:id="rIdtgmqzlhjboju4zbw9dn5e">
+      <w:hyperlink w:history="1" r:id="rIdndw957kxgh_pjccbktb9b">
         <w:r>
           <w:rPr>
             <w:color w:val="1F4E8C"/>
@@ -163,7 +163,7 @@
         </w:rPr>
         <w:t xml:space="preserve">Shipped Agreed (</w:t>
       </w:r>
-      <w:hyperlink w:history="1" r:id="rIdazwoqqe5w6v1n3_k1jydc">
+      <w:hyperlink w:history="1" r:id="rIdheu8cxhod_nwqhmb2synq">
         <w:r>
           <w:rPr>
             <w:color w:val="1F4E8C"/>
@@ -214,7 +214,7 @@
         </w:rPr>
         <w:t xml:space="preserve">Design and build websites and web apps for small businesses, including a 3D product launch site for Studio Rowan (</w:t>
       </w:r>
-      <w:hyperlink w:history="1" r:id="rIdlg6wmkretyejxn8_n4-mv">
+      <w:hyperlink w:history="1" r:id="rIdltl96zkgfedczczkm-5j1">
         <w:r>
           <w:rPr>
             <w:color w:val="1F4E8C"/>
@@ -281,7 +281,7 @@
         </w:rPr>
         <w:t xml:space="preserve">Sole developer of YotPoint (</w:t>
       </w:r>
-      <w:hyperlink w:history="1" r:id="rIdo0tfwk70yvxz9cc5picbd">
+      <w:hyperlink w:history="1" r:id="rIdkcbqrj42samctoijdosai">
         <w:r>
           <w:rPr>
             <w:color w:val="1F4E8C"/>
@@ -313,7 +313,7 @@
           <w:sz w:val="20"/>
           <w:szCs w:val="20"/>
         </w:rPr>
-        <w:t xml:space="preserve">Built Yotto, a WhatsApp assistant (Twilio) that takes job requests from crew. It calls Claude and OpenAI models through OpenRouter with tool calling to route messages, extract job details and transcribe voice notes.</w:t>
+        <w:t xml:space="preserve">Built Yotto, a WhatsApp assistant (Twilio) that takes job requests from crew. It calls LLMs through OpenRouter with tool calling to route messages, extract job details and transcribe voice notes.</w:t>
       </w:r>
     </w:p>
     <w:p>

</xml_diff>